<commit_message>
Add final report PDF
</commit_message>
<xml_diff>
--- a/F2_Team32_Report.docx
+++ b/F2_Team32_Report.docx
@@ -127,82 +127,27 @@
         <w:t/>
       </w:r>
     </w:p>
-    <w:tbl>
-      <w:tblPr>
-        <w:tblW w:w="6261" w:type="dxa"/>
+    <w:p>
+      <w:pPr>
+        <w:spacing w:line="360" w:lineRule="auto"/>
         <w:jc w:val="center"/>
-        <w:tblBorders>
-          <w:top w:val="nil"/>
-          <w:left w:val="nil"/>
-          <w:bottom w:val="nil"/>
-          <w:right w:val="nil"/>
-          <w:insideH w:val="nil"/>
-          <w:insideV w:val="nil"/>
-        </w:tblBorders>
-        <w:tblLayout w:type="fixed"/>
-        <w:tblLook w:val="0400" w:firstRow="0" w:lastRow="0" w:firstColumn="0" w:lastColumn="0" w:noHBand="0" w:noVBand="1"/>
-      </w:tblPr>
-      <w:tblGrid>
-        <w:gridCol w:w="1701"/>
-        <w:gridCol w:w="4560"/>
-      </w:tblGrid>
-      <w:tr>
-        <w:trPr>
-          <w:jc w:val="center"/>
-        </w:trPr>
-        <w:tc>
-          <w:tcPr>
-            <w:tcW w:w="1701" w:type="dxa"/>
-            <w:vAlign w:val="center"/>
-          </w:tcPr>
-          <w:p>
-            <w:pPr>
-              <w:spacing w:line="360" w:lineRule="auto"/>
-              <w:rPr>
-                <w:b/>
-                <w:bCs/>
-                <w:sz w:val="26"/>
-                <w:szCs w:val="26"/>
-              </w:rPr>
-            </w:pPr>
-            <w:r>
-              <w:rPr>
-                <w:b/>
-                <w:bCs/>
-                <w:sz w:val="26"/>
-                <w:szCs w:val="26"/>
-              </w:rPr>
-              <w:t>23BCE0043</w:t>
-            </w:r>
-          </w:p>
-        </w:tc>
-        <w:tc>
-          <w:tcPr>
-            <w:tcW w:w="4560" w:type="dxa"/>
-          </w:tcPr>
-          <w:p>
-            <w:pPr>
-              <w:spacing w:line="360" w:lineRule="auto"/>
-              <w:rPr>
-                <w:b/>
-                <w:bCs/>
-                <w:sz w:val="26"/>
-                <w:szCs w:val="26"/>
-              </w:rPr>
-            </w:pPr>
-            <w:r>
-              <w:rPr>
-                <w:b/>
-                <w:bCs/>
-                <w:sz w:val="26"/>
-                <w:szCs w:val="26"/>
-              </w:rPr>
-              <w:t>SANCHIT KUMAR</w:t>
-            </w:r>
-          </w:p>
-        </w:tc>
-      </w:tr>
-    </w:tbl>
+        <w:rPr>
+          <w:b/>
+          <w:bCs/>
+          <w:sz w:val="26"/>
+          <w:szCs w:val="26"/>
+        </w:rPr>
+      </w:pPr>
+      <w:r>
+        <w:rPr>
+          <w:b/>
+          <w:bCs/>
+          <w:sz w:val="26"/>
+          <w:szCs w:val="26"/>
+        </w:rPr>
+        <w:t xml:space="preserve">23BCE0043        SANCHIT KUMAR</w:t>
+      </w:r>
+    </w:p>
     <w:p>
       <w:pPr>
         <w:jc w:val="center"/>
@@ -756,7 +701,7 @@
         <w:ind w:left="3600" w:firstLine="720"/>
       </w:pPr>
       <w:r>
-        <w:t>Name and Signature of the Students</w:t>
+        <w:t>Sanchit Kumar</w:t>
       </w:r>
     </w:p>
     <w:p>

</xml_diff>